<commit_message>
final PowerBI dash & notes on client
</commit_message>
<xml_diff>
--- a/Kare Mobile.docx
+++ b/Kare Mobile.docx
@@ -35,15 +35,7 @@
     </w:p>
     <w:p>
       <w:r>
-        <w:t xml:space="preserve">Facts they use to support their vision: 68 </w:t>
-      </w:r>
-      <w:proofErr w:type="gramStart"/>
-      <w:r>
-        <w:t>Million</w:t>
-      </w:r>
-      <w:proofErr w:type="gramEnd"/>
-      <w:r>
-        <w:t xml:space="preserve"> people in Dental deserts. Every 10 min further away from a dentist, it’s a 10% they won’t see a dentist within a year. Someone 1hr from dentist office has 40% chance they won</w:t>
+        <w:t>Facts they use to support their vision: 68 Million people in Dental deserts. Every 10 min further away from a dentist, it’s a 10% they won’t see a dentist within a year. Someone 1hr from dentist office has 40% chance they won</w:t>
       </w:r>
       <w:r>
         <w:t>’</w:t>
@@ -55,15 +47,7 @@
         <w:t xml:space="preserve"> a</w:t>
       </w:r>
       <w:r>
-        <w:t xml:space="preserve"> </w:t>
-      </w:r>
-      <w:proofErr w:type="gramStart"/>
-      <w:r>
-        <w:t>10 pain</w:t>
-      </w:r>
-      <w:proofErr w:type="gramEnd"/>
-      <w:r>
-        <w:t xml:space="preserve"> level have seen a dentist 0 times per year</w:t>
+        <w:t xml:space="preserve"> 10 pain level have seen a dentist 0 times per year</w:t>
       </w:r>
       <w:r>
         <w:t>.</w:t>
@@ -71,12 +55,15 @@
     </w:p>
     <w:p>
       <w:r>
+        <w:t>Service/</w:t>
+      </w:r>
+      <w:r>
         <w:t>Procedures – Simple screenings, educational events, chart the patient as needing a certain treatment.</w:t>
       </w:r>
     </w:p>
     <w:p>
       <w:r>
-        <w:t>Partner relationships are currently strong &amp; directly influence the retailers &amp; locations serviced.</w:t>
+        <w:t>Partner relationships are strong.</w:t>
       </w:r>
     </w:p>
     <w:p/>
@@ -132,13 +119,8 @@
         <w:t>Want to look at files altogether</w:t>
       </w:r>
       <w:r>
-        <w:t xml:space="preserve">; Demographics in zip codes; trends against different retail orgs </w:t>
-      </w:r>
-      <w:proofErr w:type="gramStart"/>
-      <w:r>
-        <w:t>too;</w:t>
-      </w:r>
-      <w:proofErr w:type="gramEnd"/>
+        <w:t>; Demographics in zip codes; trends against different retail orgs too;</w:t>
+      </w:r>
     </w:p>
     <w:p>
       <w:pPr>
@@ -166,8 +148,20 @@
       <w:r>
         <w:t>esentation for partners</w:t>
       </w:r>
-      <w:r>
-        <w:t xml:space="preserve">; increase dental desert impact </w:t>
+    </w:p>
+    <w:p>
+      <w:pPr>
+        <w:pStyle w:val="ListParagraph"/>
+        <w:numPr>
+          <w:ilvl w:val="0"/>
+          <w:numId w:val="2"/>
+        </w:numPr>
+      </w:pPr>
+      <w:r>
+        <w:t>I</w:t>
+      </w:r>
+      <w:r>
+        <w:t xml:space="preserve">ncrease dental desert impact </w:t>
       </w:r>
       <w:r>
         <w:t>&amp;</w:t>
@@ -462,7 +456,6 @@
         <w:rPr>
           <w:u w:val="single"/>
         </w:rPr>
-        <w:lastRenderedPageBreak/>
         <w:t xml:space="preserve">Some </w:t>
       </w:r>
       <w:r>
@@ -528,13 +521,7 @@
     </w:p>
     <w:p>
       <w:r>
-        <w:t xml:space="preserve">                                                                                        </w:t>
-      </w:r>
-      <w:r>
-        <w:t xml:space="preserve"> </w:t>
-      </w:r>
-      <w:r>
-        <w:t xml:space="preserve">                                                                                                                                                                                </w:t>
+        <w:t xml:space="preserve">                                                                                                                                                                                                                                                                         </w:t>
       </w:r>
     </w:p>
     <w:p/>

</xml_diff>